<commit_message>
Use friendly vibe labels across app and guides
</commit_message>
<xml_diff>
--- a/docs/Apophenia_User_Guide.docx
+++ b/docs/Apophenia_User_Guide.docx
@@ -243,6 +243,11 @@
       </w:r>
     </w:p>
     <w:p>
+      <w:r>
+        <w:br w:type="page"/>
+      </w:r>
+    </w:p>
+    <w:p>
       <w:pPr>
         <w:pStyle w:val="Heading1"/>
       </w:pPr>
@@ -258,7 +263,7 @@
       <w:r>
         <w:drawing>
           <wp:inline xmlns:a="http://schemas.openxmlformats.org/drawingml/2006/main" xmlns:pic="http://schemas.openxmlformats.org/drawingml/2006/picture">
-            <wp:extent cx="4160520" cy="5634842"/>
+            <wp:extent cx="4160520" cy="4836649"/>
             <wp:docPr id="2" name="Picture 2" descr="Annotated capture screen with arrows to live status, timestamp-first logging, and the distinct egress event"/>
             <wp:cNvGraphicFramePr>
               <a:graphicFrameLocks noChangeAspect="1"/>
@@ -279,7 +284,7 @@
                   <pic:spPr>
                     <a:xfrm>
                       <a:off x="0" y="0"/>
-                      <a:ext cx="4160520" cy="5634842"/>
+                      <a:ext cx="4160520" cy="4836649"/>
                     </a:xfrm>
                     <a:prstGeom prst="rect"/>
                   </pic:spPr>
@@ -351,7 +356,7 @@
           <w:color w:val="111318"/>
           <w:sz w:val="22"/>
         </w:rPr>
-        <w:t>FUCK THIS, I'M OUT records VIBE 5 with egress=true, preserving the difference between leaving and staying.</w:t>
+        <w:t>NOPE, I'M OUT records VIBE 5 with egress=true, preserving the difference between leaving and staying.</w:t>
       </w:r>
     </w:p>
     <w:p>
@@ -1676,6 +1681,14 @@
         <w:t>All export routes prepare locally and show a verified manifest before a destination can be selected.</w:t>
       </w:r>
     </w:p>
+    <w:p>
+      <w:pPr>
+        <w:pStyle w:val="Heading2"/>
+      </w:pPr>
+      <w:r>
+        <w:t>Choose an export format</w:t>
+      </w:r>
+    </w:p>
     <w:tbl>
       <w:tblPr>
         <w:tblW w:type="auto" w:w="0"/>

</xml_diff>

<commit_message>
Add local recording law warnings
</commit_message>
<xml_diff>
--- a/docs/Apophenia_User_Guide.docx
+++ b/docs/Apophenia_User_Guide.docx
@@ -61,6 +61,28 @@
           <w:sz w:val="22"/>
         </w:rPr>
         <w:t>It can be maximum invasive when everything is authorized and armed. That is the capability ceiling, not the default. There is no account, analytics SDK, automatic cloud sync, or background uploader. Data stays local until an export is built, verified, previewed, and deliberately routed.</w:t>
+      </w:r>
+    </w:p>
+    <w:p>
+      <w:r>
+        <w:rPr>
+          <w:rFonts w:ascii="Aptos" w:hAnsi="Aptos"/>
+          <w:b/>
+          <w:i w:val="0"/>
+          <w:color w:val="111318"/>
+          <w:sz w:val="22"/>
+        </w:rPr>
+        <w:t xml:space="preserve">Follow local recording laws. </w:t>
+      </w:r>
+      <w:r>
+        <w:rPr>
+          <w:rFonts w:ascii="Aptos" w:hAnsi="Aptos"/>
+          <w:b w:val="0"/>
+          <w:i w:val="0"/>
+          <w:color w:val="111318"/>
+          <w:sz w:val="22"/>
+        </w:rPr>
+        <w:t>Recording, privacy, wiretap, workplace, traffic, and RF rules vary by place and situation. Some places require every person being recorded to consent, often described as two-party or all-party consent. Apophenia cannot determine your jurisdiction or give you legal authority. Obtain any required consent before recording.</w:t>
       </w:r>
     </w:p>
     <w:p>
@@ -396,7 +418,7 @@
       <w:r>
         <w:drawing>
           <wp:inline xmlns:a="http://schemas.openxmlformats.org/drawingml/2006/main" xmlns:pic="http://schemas.openxmlformats.org/drawingml/2006/picture">
-            <wp:extent cx="6126480" cy="4084320"/>
+            <wp:extent cx="3108960" cy="6901005"/>
             <wp:docPr id="3" name="Picture 3" descr="Annotated Settings screen with arrows to TOTAL_EVIDENCE, the permission boundary, and the FIELD preset"/>
             <wp:cNvGraphicFramePr>
               <a:graphicFrameLocks noChangeAspect="1"/>
@@ -417,7 +439,7 @@
                   <pic:spPr>
                     <a:xfrm>
                       <a:off x="0" y="0"/>
-                      <a:ext cx="6126480" cy="4084320"/>
+                      <a:ext cx="3108960" cy="6901005"/>
                     </a:xfrm>
                     <a:prstGeom prst="rect"/>
                   </pic:spPr>

</xml_diff>